<commit_message>
Add a landing route at / so the base URL is not a 404
Opening http://127.0.0.1:8000/ in a browser returned 404 because the API had
no root route. GET / now returns service status and links to /docs, the main
endpoints and how to start the dashboard. Adds a test, a README endpoint row
and a troubleshooting entry, updates the verification record (156 tests, the
author's successful laptop setup) and regenerates the report accordingly.

Co-Authored-By: Claude Opus 5.5 <noreply@anthropic.com>
Claude-Session: https://claude.ai/code/session_0162SfoUSmT7kPwzg6jJXZjW
</commit_message>
<xml_diff>
--- a/docs/report/MOC_Project_Report_AI_Prompt_Injection_DFA.docx
+++ b/docs/report/MOC_Project_Report_AI_Prompt_Injection_DFA.docx
@@ -291,7 +291,7 @@
         <w:jc w:val="both"/>
       </w:pPr>
       <w:r>
-        <w:t xml:space="preserve">Applications built on large language models (LLMs) are exposed to prompt injection: untrusted text that tries to override an application's instructions, extract its hidden system prompt or bypass safety rules. This project investigates how well a classical model of computation can detect such attacks. The objective is a local, deterministic and explainable detector that recognizes a configurable set of known injection phrasings, reports evidence and recommends ALLOW, FLAG or BLOCK. The selected model is the deterministic finite automaton (DFA). Detection patterns from a JSON rule file are normalized, tokenized and inserted into a token-level Aho–Corasick trie, which is compiled into a complete DFA M = (Q, Σ, δ, q₀, F) with an output function, so every input token costs one table lookup. The Python implementation records the state trace of every scan and adds risk scoring, configurable policies, a REST API, a dashboard and privacy-preserving audit logging. With 19 rules and 219 patterns, the automaton has 464 states and 171 input symbols. All 155 automated tests pass, and the measured scan time grew linearly with input length but stayed constant as patterns were added. On an illustrative corpus of 90 hand-written examples, precision was 0.879, recall 0.850 and F1 0.864. Paraphrased attacks were missed and quoted attack phrases were flagged. The project shows that a DFA is a fast, reproducible and auditable recognizer for known attack phrasings, and makes clear why a regular language cannot capture the meaning of a prompt injection.</w:t>
+        <w:t xml:space="preserve">Applications built on large language models (LLMs) are exposed to prompt injection: untrusted text that tries to override an application's instructions, extract its hidden system prompt or bypass safety rules. This project investigates how well a classical model of computation can detect such attacks. The objective is a local, deterministic and explainable detector that recognizes a configurable set of known injection phrasings, reports evidence and recommends ALLOW, FLAG or BLOCK. The selected model is the deterministic finite automaton (DFA). Detection patterns from a JSON rule file are normalized, tokenized and inserted into a token-level Aho–Corasick trie, which is compiled into a complete DFA M = (Q, Σ, δ, q₀, F) with an output function, so every input token costs one table lookup. The Python implementation records the state trace of every scan and adds risk scoring, configurable policies, a REST API, a dashboard and privacy-preserving audit logging. With 19 rules and 219 patterns, the automaton has 464 states and 171 input symbols. All 156 automated tests pass, and the measured scan time grew linearly with input length but stayed constant as patterns were added. On an illustrative corpus of 90 hand-written examples, precision was 0.879, recall 0.850 and F1 0.864. Paraphrased attacks were missed and quoted attack phrases were flagged. The project shows that a DFA is a fast, reproducible and auditable recognizer for known attack phrasings, and makes clear why a regular language cannot capture the meaning of a prompt injection.</w:t>
       </w:r>
     </w:p>
     <w:p>
@@ -21515,7 +21515,7 @@
                 <w:sz w:val="20"/>
                 <w:szCs w:val="20"/>
               </w:rPr>
-              <w:t xml:space="preserve">155 pytest tests</w:t>
+              <w:t xml:space="preserve">156 pytest tests</w:t>
             </w:r>
           </w:p>
         </w:tc>
@@ -21540,6 +21540,17 @@
       </w:r>
       <w:r>
         <w:t xml:space="preserve"> The service exposes </w:t>
+      </w:r>
+      <w:r>
+        <w:rPr>
+          <w:rFonts w:ascii="Courier New" w:cs="Courier New" w:eastAsia="Courier New" w:hAnsi="Courier New"/>
+          <w:sz w:val="21"/>
+          <w:szCs w:val="21"/>
+        </w:rPr>
+        <w:t xml:space="preserve">GET /</w:t>
+      </w:r>
+      <w:r>
+        <w:t xml:space="preserve"> (service information and links), </w:t>
       </w:r>
       <w:r>
         <w:rPr>
@@ -24680,7 +24691,7 @@
         <w:jc w:val="both"/>
       </w:pPr>
       <w:r>
-        <w:t xml:space="preserve">The pytest suite has 155 tests. All of them passed on Python 3.13 and on a fresh Python 3.11 installation. The tests check behaviour, not merely execution. The automaton tests check the formal properties directly: δ has exactly one entry for every (state, symbol) pair; the failure links equal a brute-force "longest proper suffix" computation; &lt;skip&gt; is a self-loop and &lt;other&gt; a reset; and the matches equal those of a naive matcher on 2,000 random inputs. As a check that the tests can fail, the failure-function construction was deliberately broken once: 11 tests failed, and they passed again after the code was restored.</w:t>
+        <w:t xml:space="preserve">The pytest suite has 156 tests. All of them passed on Python 3.13 and on a fresh Python 3.11 installation. The tests check behaviour, not merely execution. The automaton tests check the formal properties directly: δ has exactly one entry for every (state, symbol) pair; the failure links equal a brute-force "longest proper suffix" computation; &lt;skip&gt; is a self-loop and &lt;other&gt; a reset; and the matches equal those of a naive matcher on 2,000 random inputs. As a check that the tests can fail, the failure-function construction was deliberately broken once: 11 tests failed, and all tests passed again after the code was restored.</w:t>
       </w:r>
     </w:p>
     <w:p>
@@ -25291,7 +25302,7 @@
                 <w:sz w:val="20"/>
                 <w:szCs w:val="20"/>
               </w:rPr>
-              <w:t xml:space="preserve">30</w:t>
+              <w:t xml:space="preserve">31</w:t>
             </w:r>
           </w:p>
         </w:tc>
@@ -25492,7 +25503,7 @@
                 <w:sz w:val="20"/>
                 <w:szCs w:val="20"/>
               </w:rPr>
-              <w:t xml:space="preserve">155</w:t>
+              <w:t xml:space="preserve">156</w:t>
             </w:r>
           </w:p>
         </w:tc>
@@ -25525,7 +25536,7 @@
                 <w:sz w:val="20"/>
                 <w:szCs w:val="20"/>
               </w:rPr>
-              <w:t xml:space="preserve">155 passed, 0 failed</w:t>
+              <w:t xml:space="preserve">156 passed, 0 failed</w:t>
             </w:r>
           </w:p>
         </w:tc>
@@ -31977,7 +31988,29 @@
         <w:jc w:val="both"/>
       </w:pPr>
       <w:r>
-        <w:t xml:space="preserve">The project was installed from scratch with the provided script and tested on Python 3.13 and 3.11. The API and dashboard were started locally, and every dashboard page was opened in a headless browser without errors. Rule enabling, disabling and adding from the dashboard worked end to end. The Docker image was built and both containers were started with Docker Compose; the API reported healthy and the containerized dashboard reached it. Two caveats apply: the image build in the development sandbox needed the sandbox's TLS certificate passed to pip, and the system has not yet been run on a physical Ubuntu laptop.</w:t>
+        <w:t xml:space="preserve">The project was installed from scratch with the provided script and tested on Python 3.13 and 3.11. The API and dashboard were started locally, and every dashboard page was opened in a headless browser without errors. Rule enabling, disabling and adding from the dashboard worked end to end. The Docker image was built and both containers were started with Docker Compose; the API reported healthy and the containerized dashboard reached it. On the author's own laptop, </w:t>
+      </w:r>
+      <w:r>
+        <w:rPr>
+          <w:rFonts w:ascii="Courier New" w:cs="Courier New" w:eastAsia="Courier New" w:hAnsi="Courier New"/>
+          <w:sz w:val="21"/>
+          <w:szCs w:val="21"/>
+        </w:rPr>
+        <w:t xml:space="preserve">./run_local.sh setup</w:t>
+      </w:r>
+      <w:r>
+        <w:t xml:space="preserve"> installed all dependencies (Python 3.12) and </w:t>
+      </w:r>
+      <w:r>
+        <w:rPr>
+          <w:rFonts w:ascii="Courier New" w:cs="Courier New" w:eastAsia="Courier New" w:hAnsi="Courier New"/>
+          <w:sz w:val="21"/>
+          <w:szCs w:val="21"/>
+        </w:rPr>
+        <w:t xml:space="preserve">./run_local.sh api</w:t>
+      </w:r>
+      <w:r>
+        <w:t xml:space="preserve"> started the service successfully. One caveat applies: the image build in the development sandbox needed the sandbox's TLS certificate passed to pip.</w:t>
       </w:r>
     </w:p>
     <w:p>
@@ -32376,7 +32409,7 @@
         <w:t xml:space="preserve">0</w:t>
       </w:r>
       <w:r>
-        <w:t xml:space="preserve">, F) with an output function λ, which scans text with one table lookup per token and records its state trace. Around this recognizer, a working application provides normalization, explainable risk scoring, ALLOW/FLAG/BLOCK policies, a REST API, a dashboard, privacy-preserving audit logging, 155 passing tests and an evaluation dataset.</w:t>
+        <w:t xml:space="preserve">, F) with an output function λ, which scans text with one table lookup per token and records its state trace. Around this recognizer, a working application provides normalization, explainable risk scoring, ALLOW/FLAG/BLOCK policies, a REST API, a dashboard, privacy-preserving audit logging, 156 passing tests and an evaluation dataset.</w:t>
       </w:r>
     </w:p>
     <w:p>

</xml_diff>

<commit_message>
Fill in report cover page: VIT Vellore and project team
Cover now names Vellore Institute of Technology, Vellore and lists the team
(Sharan Kumar VR 25BYB0047, Akula Varsha 25BYB0053, Polisetti Ananya
25BYB0197). Report and verification record refer to the team instead of a
single author. School, course code and faculty guide remain placeholders.

Co-Authored-By: Claude Opus 5.5 <noreply@anthropic.com>
Claude-Session: https://claude.ai/code/session_0162SfoUSmT7kPwzg6jJXZjW
</commit_message>
<xml_diff>
--- a/docs/report/MOC_Project_Report_AI_Prompt_Injection_DFA.docx
+++ b/docs/report/MOC_Project_Report_AI_Prompt_Injection_DFA.docx
@@ -4,7 +4,7 @@
   <w:body>
     <w:p>
       <w:pPr>
-        <w:spacing w:after="60" w:before="600" w:line="276"/>
+        <w:spacing w:after="60" w:before="400" w:line="276"/>
         <w:jc w:val="center"/>
       </w:pPr>
       <w:r>
@@ -13,14 +13,13 @@
           <w:bCs/>
           <w:sz w:val="30"/>
           <w:szCs w:val="30"/>
-          <w:highlight w:val="yellow"/>
-        </w:rPr>
-        <w:t xml:space="preserve">[UNIVERSITY NAME]</w:t>
+        </w:rPr>
+        <w:t xml:space="preserve">VELLORE INSTITUTE OF TECHNOLOGY, VELLORE</w:t>
       </w:r>
     </w:p>
     <w:p>
       <w:pPr>
-        <w:spacing w:after="1100" w:before="0" w:line="276"/>
+        <w:spacing w:after="900" w:before="0" w:line="276"/>
         <w:jc w:val="center"/>
       </w:pPr>
       <w:r>
@@ -29,7 +28,7 @@
           <w:szCs w:val="24"/>
           <w:highlight w:val="yellow"/>
         </w:rPr>
-        <w:t xml:space="preserve">[School / Department of Computer Science and Engineering]</w:t>
+        <w:t xml:space="preserve">[School name]</w:t>
       </w:r>
     </w:p>
     <w:p>
@@ -127,7 +126,7 @@
     </w:p>
     <w:p>
       <w:pPr>
-        <w:spacing w:after="1100" w:before="0" w:line="276"/>
+        <w:spacing w:after="800" w:before="0" w:line="276"/>
         <w:jc w:val="center"/>
       </w:pPr>
       <w:r>
@@ -140,7 +139,7 @@
     </w:p>
     <w:p>
       <w:pPr>
-        <w:spacing w:after="80" w:before="0" w:line="276"/>
+        <w:spacing w:after="120" w:before="0" w:line="276"/>
         <w:jc w:val="center"/>
       </w:pPr>
       <w:r>
@@ -153,42 +152,309 @@
         <w:t xml:space="preserve">Submitted by</w:t>
       </w:r>
     </w:p>
+    <w:tbl>
+      <w:tblPr>
+        <w:tblW w:type="dxa" w:w="5400"/>
+        <w:jc w:val="center"/>
+        <w:tblBorders>
+          <w:top w:val="none" w:color="FFFFFF" w:sz="0"/>
+          <w:left w:val="none" w:color="FFFFFF" w:sz="0"/>
+          <w:bottom w:val="none" w:color="FFFFFF" w:sz="0"/>
+          <w:right w:val="none" w:color="FFFFFF" w:sz="0"/>
+          <w:insideH w:val="none" w:color="FFFFFF" w:sz="0"/>
+          <w:insideV w:val="none" w:color="FFFFFF" w:sz="0"/>
+        </w:tblBorders>
+        <w:tblLayout w:type="fixed"/>
+      </w:tblPr>
+      <w:tblGrid>
+        <w:gridCol w:w="3300"/>
+        <w:gridCol w:w="2100"/>
+      </w:tblGrid>
+      <w:tr>
+        <w:tc>
+          <w:tcPr>
+            <w:tcW w:type="dxa" w:w="3300"/>
+            <w:tcBorders>
+              <w:top w:val="none" w:color="FFFFFF" w:sz="0"/>
+              <w:left w:val="none" w:color="FFFFFF" w:sz="0"/>
+              <w:bottom w:val="single" w:color="808080" w:sz="4"/>
+              <w:right w:val="none" w:color="FFFFFF" w:sz="0"/>
+            </w:tcBorders>
+            <w:tcMar>
+              <w:top w:type="dxa" w:w="40"/>
+              <w:left w:type="dxa" w:w="80"/>
+              <w:bottom w:type="dxa" w:w="40"/>
+              <w:right w:type="dxa" w:w="80"/>
+            </w:tcMar>
+          </w:tcPr>
+          <w:p>
+            <w:pPr>
+              <w:spacing w:after="0"/>
+              <w:jc w:val="left"/>
+            </w:pPr>
+            <w:r>
+              <w:rPr>
+                <w:b w:val="false"/>
+                <w:bCs w:val="false"/>
+                <w:i/>
+                <w:iCs/>
+                <w:sz w:val="22"/>
+                <w:szCs w:val="22"/>
+              </w:rPr>
+              <w:t xml:space="preserve">Name</w:t>
+            </w:r>
+          </w:p>
+        </w:tc>
+        <w:tc>
+          <w:tcPr>
+            <w:tcW w:type="dxa" w:w="2100"/>
+            <w:tcBorders>
+              <w:top w:val="none" w:color="FFFFFF" w:sz="0"/>
+              <w:left w:val="none" w:color="FFFFFF" w:sz="0"/>
+              <w:bottom w:val="single" w:color="808080" w:sz="4"/>
+              <w:right w:val="none" w:color="FFFFFF" w:sz="0"/>
+            </w:tcBorders>
+            <w:tcMar>
+              <w:top w:type="dxa" w:w="40"/>
+              <w:left w:type="dxa" w:w="80"/>
+              <w:bottom w:type="dxa" w:w="40"/>
+              <w:right w:type="dxa" w:w="80"/>
+            </w:tcMar>
+          </w:tcPr>
+          <w:p>
+            <w:pPr>
+              <w:spacing w:after="0"/>
+              <w:jc w:val="center"/>
+            </w:pPr>
+            <w:r>
+              <w:rPr>
+                <w:b w:val="false"/>
+                <w:bCs w:val="false"/>
+                <w:i/>
+                <w:iCs/>
+                <w:sz w:val="22"/>
+                <w:szCs w:val="22"/>
+              </w:rPr>
+              <w:t xml:space="preserve">Register No.</w:t>
+            </w:r>
+          </w:p>
+        </w:tc>
+      </w:tr>
+      <w:tr>
+        <w:tc>
+          <w:tcPr>
+            <w:tcW w:type="dxa" w:w="3300"/>
+            <w:tcBorders>
+              <w:top w:val="none" w:color="FFFFFF" w:sz="0"/>
+              <w:left w:val="none" w:color="FFFFFF" w:sz="0"/>
+              <w:bottom w:val="none" w:color="FFFFFF" w:sz="0"/>
+              <w:right w:val="none" w:color="FFFFFF" w:sz="0"/>
+            </w:tcBorders>
+            <w:tcMar>
+              <w:top w:type="dxa" w:w="40"/>
+              <w:left w:type="dxa" w:w="80"/>
+              <w:bottom w:type="dxa" w:w="40"/>
+              <w:right w:type="dxa" w:w="80"/>
+            </w:tcMar>
+          </w:tcPr>
+          <w:p>
+            <w:pPr>
+              <w:spacing w:after="0"/>
+              <w:jc w:val="left"/>
+            </w:pPr>
+            <w:r>
+              <w:rPr>
+                <w:b/>
+                <w:bCs/>
+                <w:i w:val="false"/>
+                <w:iCs w:val="false"/>
+                <w:sz w:val="26"/>
+                <w:szCs w:val="26"/>
+              </w:rPr>
+              <w:t xml:space="preserve">Sharan Kumar VR</w:t>
+            </w:r>
+          </w:p>
+        </w:tc>
+        <w:tc>
+          <w:tcPr>
+            <w:tcW w:type="dxa" w:w="2100"/>
+            <w:tcBorders>
+              <w:top w:val="none" w:color="FFFFFF" w:sz="0"/>
+              <w:left w:val="none" w:color="FFFFFF" w:sz="0"/>
+              <w:bottom w:val="none" w:color="FFFFFF" w:sz="0"/>
+              <w:right w:val="none" w:color="FFFFFF" w:sz="0"/>
+            </w:tcBorders>
+            <w:tcMar>
+              <w:top w:type="dxa" w:w="40"/>
+              <w:left w:type="dxa" w:w="80"/>
+              <w:bottom w:type="dxa" w:w="40"/>
+              <w:right w:type="dxa" w:w="80"/>
+            </w:tcMar>
+          </w:tcPr>
+          <w:p>
+            <w:pPr>
+              <w:spacing w:after="0"/>
+              <w:jc w:val="center"/>
+            </w:pPr>
+            <w:r>
+              <w:rPr>
+                <w:b w:val="false"/>
+                <w:bCs w:val="false"/>
+                <w:i w:val="false"/>
+                <w:iCs w:val="false"/>
+                <w:sz w:val="26"/>
+                <w:szCs w:val="26"/>
+              </w:rPr>
+              <w:t xml:space="preserve">25BYB0047</w:t>
+            </w:r>
+          </w:p>
+        </w:tc>
+      </w:tr>
+      <w:tr>
+        <w:tc>
+          <w:tcPr>
+            <w:tcW w:type="dxa" w:w="3300"/>
+            <w:tcBorders>
+              <w:top w:val="none" w:color="FFFFFF" w:sz="0"/>
+              <w:left w:val="none" w:color="FFFFFF" w:sz="0"/>
+              <w:bottom w:val="none" w:color="FFFFFF" w:sz="0"/>
+              <w:right w:val="none" w:color="FFFFFF" w:sz="0"/>
+            </w:tcBorders>
+            <w:tcMar>
+              <w:top w:type="dxa" w:w="40"/>
+              <w:left w:type="dxa" w:w="80"/>
+              <w:bottom w:type="dxa" w:w="40"/>
+              <w:right w:type="dxa" w:w="80"/>
+            </w:tcMar>
+          </w:tcPr>
+          <w:p>
+            <w:pPr>
+              <w:spacing w:after="0"/>
+              <w:jc w:val="left"/>
+            </w:pPr>
+            <w:r>
+              <w:rPr>
+                <w:b/>
+                <w:bCs/>
+                <w:i w:val="false"/>
+                <w:iCs w:val="false"/>
+                <w:sz w:val="26"/>
+                <w:szCs w:val="26"/>
+              </w:rPr>
+              <w:t xml:space="preserve">Akula Varsha</w:t>
+            </w:r>
+          </w:p>
+        </w:tc>
+        <w:tc>
+          <w:tcPr>
+            <w:tcW w:type="dxa" w:w="2100"/>
+            <w:tcBorders>
+              <w:top w:val="none" w:color="FFFFFF" w:sz="0"/>
+              <w:left w:val="none" w:color="FFFFFF" w:sz="0"/>
+              <w:bottom w:val="none" w:color="FFFFFF" w:sz="0"/>
+              <w:right w:val="none" w:color="FFFFFF" w:sz="0"/>
+            </w:tcBorders>
+            <w:tcMar>
+              <w:top w:type="dxa" w:w="40"/>
+              <w:left w:type="dxa" w:w="80"/>
+              <w:bottom w:type="dxa" w:w="40"/>
+              <w:right w:type="dxa" w:w="80"/>
+            </w:tcMar>
+          </w:tcPr>
+          <w:p>
+            <w:pPr>
+              <w:spacing w:after="0"/>
+              <w:jc w:val="center"/>
+            </w:pPr>
+            <w:r>
+              <w:rPr>
+                <w:b w:val="false"/>
+                <w:bCs w:val="false"/>
+                <w:i w:val="false"/>
+                <w:iCs w:val="false"/>
+                <w:sz w:val="26"/>
+                <w:szCs w:val="26"/>
+              </w:rPr>
+              <w:t xml:space="preserve">25BYB0053</w:t>
+            </w:r>
+          </w:p>
+        </w:tc>
+      </w:tr>
+      <w:tr>
+        <w:tc>
+          <w:tcPr>
+            <w:tcW w:type="dxa" w:w="3300"/>
+            <w:tcBorders>
+              <w:top w:val="none" w:color="FFFFFF" w:sz="0"/>
+              <w:left w:val="none" w:color="FFFFFF" w:sz="0"/>
+              <w:bottom w:val="none" w:color="FFFFFF" w:sz="0"/>
+              <w:right w:val="none" w:color="FFFFFF" w:sz="0"/>
+            </w:tcBorders>
+            <w:tcMar>
+              <w:top w:type="dxa" w:w="40"/>
+              <w:left w:type="dxa" w:w="80"/>
+              <w:bottom w:type="dxa" w:w="40"/>
+              <w:right w:type="dxa" w:w="80"/>
+            </w:tcMar>
+          </w:tcPr>
+          <w:p>
+            <w:pPr>
+              <w:spacing w:after="0"/>
+              <w:jc w:val="left"/>
+            </w:pPr>
+            <w:r>
+              <w:rPr>
+                <w:b/>
+                <w:bCs/>
+                <w:i w:val="false"/>
+                <w:iCs w:val="false"/>
+                <w:sz w:val="26"/>
+                <w:szCs w:val="26"/>
+              </w:rPr>
+              <w:t xml:space="preserve">Polisetti Ananya</w:t>
+            </w:r>
+          </w:p>
+        </w:tc>
+        <w:tc>
+          <w:tcPr>
+            <w:tcW w:type="dxa" w:w="2100"/>
+            <w:tcBorders>
+              <w:top w:val="none" w:color="FFFFFF" w:sz="0"/>
+              <w:left w:val="none" w:color="FFFFFF" w:sz="0"/>
+              <w:bottom w:val="none" w:color="FFFFFF" w:sz="0"/>
+              <w:right w:val="none" w:color="FFFFFF" w:sz="0"/>
+            </w:tcBorders>
+            <w:tcMar>
+              <w:top w:type="dxa" w:w="40"/>
+              <w:left w:type="dxa" w:w="80"/>
+              <w:bottom w:type="dxa" w:w="40"/>
+              <w:right w:type="dxa" w:w="80"/>
+            </w:tcMar>
+          </w:tcPr>
+          <w:p>
+            <w:pPr>
+              <w:spacing w:after="0"/>
+              <w:jc w:val="center"/>
+            </w:pPr>
+            <w:r>
+              <w:rPr>
+                <w:b w:val="false"/>
+                <w:bCs w:val="false"/>
+                <w:i w:val="false"/>
+                <w:iCs w:val="false"/>
+                <w:sz w:val="26"/>
+                <w:szCs w:val="26"/>
+              </w:rPr>
+              <w:t xml:space="preserve">25BYB0197</w:t>
+            </w:r>
+          </w:p>
+        </w:tc>
+      </w:tr>
+    </w:tbl>
     <w:p>
       <w:pPr>
-        <w:spacing w:after="40" w:before="0" w:line="276"/>
-        <w:jc w:val="center"/>
+        <w:spacing w:after="600"/>
       </w:pPr>
-      <w:r>
-        <w:rPr>
-          <w:b/>
-          <w:bCs/>
-          <w:sz w:val="26"/>
-          <w:szCs w:val="26"/>
-          <w:highlight w:val="yellow"/>
-        </w:rPr>
-        <w:t xml:space="preserve">[Student Name]</w:t>
-      </w:r>
-    </w:p>
-    <w:p>
-      <w:pPr>
-        <w:spacing w:after="700" w:before="0" w:line="276"/>
-        <w:jc w:val="center"/>
-      </w:pPr>
-      <w:r>
-        <w:rPr>
-          <w:sz w:val="24"/>
-          <w:szCs w:val="24"/>
-        </w:rPr>
-        <w:t xml:space="preserve">Register No.: </w:t>
-      </w:r>
-      <w:r>
-        <w:rPr>
-          <w:sz w:val="24"/>
-          <w:szCs w:val="24"/>
-          <w:highlight w:val="yellow"/>
-        </w:rPr>
-        <w:t xml:space="preserve">[Register Number]</w:t>
-      </w:r>
     </w:p>
     <w:p>
       <w:pPr>
@@ -25581,7 +25847,7 @@
         <w:t xml:space="preserve">held-out</w:t>
       </w:r>
       <w:r>
-        <w:t xml:space="preserve"> split (40 examples) was written before the first evaluation run and never used to tune rules. Both splits were written by the author of the rules, so the numbers are </w:t>
+        <w:t xml:space="preserve"> split (40 examples) was written before the first evaluation run and never used to tune rules. Both splits were written by the project team, who also wrote the rules, so the numbers are </w:t>
       </w:r>
       <w:r>
         <w:rPr>
@@ -31988,7 +32254,7 @@
         <w:jc w:val="both"/>
       </w:pPr>
       <w:r>
-        <w:t xml:space="preserve">The project was installed from scratch with the provided script and tested on Python 3.13 and 3.11. The API and dashboard were started locally, and every dashboard page was opened in a headless browser without errors. Rule enabling, disabling and adding from the dashboard worked end to end. The Docker image was built and both containers were started with Docker Compose; the API reported healthy and the containerized dashboard reached it. On the author's own laptop, </w:t>
+        <w:t xml:space="preserve">The project was installed from scratch with the provided script and tested on Python 3.13 and 3.11. The API and dashboard were started locally, and every dashboard page was opened in a headless browser without errors. Rule enabling, disabling and adding from the dashboard worked end to end. The Docker image was built and both containers were started with Docker Compose; the API reported healthy and the containerized dashboard reached it. On a team member's own laptop, </w:t>
       </w:r>
       <w:r>
         <w:rPr>
@@ -32308,7 +32574,7 @@
         <w:t xml:space="preserve">Small, self-written dataset.</w:t>
       </w:r>
       <w:r>
-        <w:t xml:space="preserve"> 90 examples written by the rule author cannot establish real-world effectiveness.</w:t>
+        <w:t xml:space="preserve"> 90 examples written by the same team that wrote the rules cannot establish real-world effectiveness.</w:t>
       </w:r>
     </w:p>
     <w:p>

</xml_diff>

<commit_message>
Complete report cover: SCORE, BACSE201 and faculty guide
Fills the remaining cover fields: School of Computer Science Engineering and
Information Systems (SCORE), course code BACSE201, and faculty guide
Dharmendra Singh Rajput. No placeholders remain.

Co-Authored-By: Claude Opus 5.5 <noreply@anthropic.com>
Claude-Session: https://claude.ai/code/session_0162SfoUSmT7kPwzg6jJXZjW
</commit_message>
<xml_diff>
--- a/docs/report/MOC_Project_Report_AI_Prompt_Injection_DFA.docx
+++ b/docs/report/MOC_Project_Report_AI_Prompt_Injection_DFA.docx
@@ -26,9 +26,8 @@
         <w:rPr>
           <w:sz w:val="24"/>
           <w:szCs w:val="24"/>
-          <w:highlight w:val="yellow"/>
-        </w:rPr>
-        <w:t xml:space="preserve">[School name]</w:t>
+        </w:rPr>
+        <w:t xml:space="preserve">School of Computer Science Engineering and Information Systems (SCORE)</w:t>
       </w:r>
     </w:p>
     <w:p>
@@ -93,22 +92,7 @@
           <w:sz w:val="24"/>
           <w:szCs w:val="24"/>
         </w:rPr>
-        <w:t xml:space="preserve"> (</w:t>
-      </w:r>
-      <w:r>
-        <w:rPr>
-          <w:sz w:val="24"/>
-          <w:szCs w:val="24"/>
-          <w:highlight w:val="yellow"/>
-        </w:rPr>
-        <w:t xml:space="preserve">[Course Code]</w:t>
-      </w:r>
-      <w:r>
-        <w:rPr>
-          <w:sz w:val="24"/>
-          <w:szCs w:val="24"/>
-        </w:rPr>
-        <w:t xml:space="preserve">)</w:t>
+        <w:t xml:space="preserve"> (BACSE201)</w:t>
       </w:r>
     </w:p>
     <w:p>
@@ -482,9 +466,8 @@
           <w:bCs/>
           <w:sz w:val="26"/>
           <w:szCs w:val="26"/>
-          <w:highlight w:val="yellow"/>
-        </w:rPr>
-        <w:t xml:space="preserve">[Faculty Name]</w:t>
+        </w:rPr>
+        <w:t xml:space="preserve">Dharmendra Singh Rajput</w:t>
       </w:r>
     </w:p>
     <w:p>
@@ -496,24 +479,8 @@
         <w:rPr>
           <w:sz w:val="24"/>
           <w:szCs w:val="24"/>
-          <w:highlight w:val="yellow"/>
-        </w:rPr>
-        <w:t xml:space="preserve">[Designation]</w:t>
-      </w:r>
-      <w:r>
-        <w:rPr>
-          <w:sz w:val="24"/>
-          <w:szCs w:val="24"/>
-        </w:rPr>
-        <w:t xml:space="preserve">, </w:t>
-      </w:r>
-      <w:r>
-        <w:rPr>
-          <w:sz w:val="24"/>
-          <w:szCs w:val="24"/>
-          <w:highlight w:val="yellow"/>
-        </w:rPr>
-        <w:t xml:space="preserve">[Department]</w:t>
+        </w:rPr>
+        <w:t xml:space="preserve">SCORE, Vellore Institute of Technology, Vellore</w:t>
       </w:r>
     </w:p>
     <w:p>

</xml_diff>